<commit_message>
Report template: fill in Tabitha Tabb on the title page
Co-Authored-By: Claude Opus 5.5 <noreply@anthropic.com>
</commit_message>
<xml_diff>
--- a/report/ESDL_Project1_Report_TEMPLATE.docx
+++ b/report/ESDL_Project1_Report_TEMPLATE.docx
@@ -78,20 +78,12 @@
         <w:pStyle w:val="BodyText"/>
         <w:bidi w:val="0"/>
         <w:spacing w:lineRule="auto" w:line="360"/>
-        <w:ind w:hanging="0" w:left="0" w:right="0"/>
         <w:jc w:val="center"/>
         <w:rPr/>
       </w:pPr>
       <w:r>
         <w:rPr/>
-        <w:t xml:space="preserve">Design team: Terrence Parham and </w:t>
-      </w:r>
-      <w:r>
-        <w:rPr>
-          <w:i/>
-          <w:shd w:fill="FFE9A8" w:val="clear"/>
-        </w:rPr>
-        <w:t>[Tabitha — surname]</w:t>
+        <w:t>Design team: Terrence Parham and Tabitha Tabb</w:t>
       </w:r>
     </w:p>
     <w:p>

</xml_diff>